<commit_message>
Simplify powers lesson plan, add printable activity cards, rename exit card to assessment card
Co-Authored-By: Claude Opus 5.5 <noreply@anthropic.com>
Claude-Session: https://claude.ai/code/session_017JUyyiwxAfDv5ntrydzjix
</commit_message>
<xml_diff>
--- a/lesson-plans/تحضير-درس-القوى.docx
+++ b/lesson-plans/تحضير-درس-القوى.docx
@@ -842,7 +842,7 @@
           <w:szCs w:val="24"/>
           <w:rtl w:val="1"/>
         </w:rPr>
-        <w:t xml:space="preserve">أن يكتب التلميذ جداء عوامل متساوية على شكل قوة ‪aⁿ‬.</w:t>
+        <w:t xml:space="preserve">أن يكتب التلميذ جداء عوامل متساوية على شكل قوة.</w:t>
       </w:r>
     </w:p>
     <w:p>
@@ -870,7 +870,7 @@
           <w:szCs w:val="24"/>
           <w:rtl w:val="1"/>
         </w:rPr>
-        <w:t xml:space="preserve">أن يحدّد التلميذ الأساس والأس في قوة معطاة ويقرأها قراءة صحيحة.</w:t>
+        <w:t xml:space="preserve">أن يحدّد التلميذ الأساس والأس في قوة معطاة.</w:t>
       </w:r>
     </w:p>
     <w:p>
@@ -898,35 +898,7 @@
           <w:szCs w:val="24"/>
           <w:rtl w:val="1"/>
         </w:rPr>
-        <w:t xml:space="preserve">أن يحسب التلميذ قيمة قوة لعدد طبيعي (مربّع العدد ومكعّبه).</w:t>
-      </w:r>
-    </w:p>
-    <w:p>
-      <w:pPr>
-        <w:numPr>
-          <w:ilvl w:val="0"/>
-          <w:numId w:val="1"/>
-        </w:numPr>
-        <w:bidi w:val="1"/>
-        <w:spacing w:after="0" w:lineRule="auto"/>
-        <w:ind w:left="720" w:hanging="360"/>
-        <w:rPr>
-          <w:rFonts w:ascii="Times New Roman" w:cs="Times New Roman" w:eastAsia="Times New Roman" w:hAnsi="Times New Roman"/>
-          <w:b w:val="1"/>
-          <w:sz w:val="24"/>
-          <w:szCs w:val="24"/>
-          <w:u w:val="none"/>
-        </w:rPr>
-      </w:pPr>
-      <w:r>
-        <w:rPr>
-          <w:rFonts w:ascii="Times New Roman" w:cs="Times New Roman" w:eastAsia="Times New Roman" w:hAnsi="Times New Roman"/>
-          <w:b w:val="1"/>
-          <w:sz w:val="24"/>
-          <w:szCs w:val="24"/>
-          <w:rtl w:val="1"/>
-        </w:rPr>
-        <w:t xml:space="preserve">أن يميّز التلميذ بين القوة ‪2³‬ والجداء ‪2×3‬.</w:t>
+        <w:t xml:space="preserve">أن يحسب التلميذ قيمة قوة بسيطة.</w:t>
       </w:r>
     </w:p>
     <w:p>
@@ -994,7 +966,7 @@
           <w:vertAlign w:val="baseline"/>
           <w:rtl w:val="1"/>
         </w:rPr>
-        <w:t>المصطلحات (جديدة-علمية): القوة، الأساس، الأس، مربّع العدد، مكعّب العدد.</w:t>
+        <w:t>المصطلحات (جديدة-علمية): القوة، الأساس، الأس.</w:t>
       </w:r>
       <w:r>
         <w:rPr>
@@ -1087,7 +1059,7 @@
           <w:u w:val="single"/>
           <w:rtl w:val="1"/>
         </w:rPr>
-        <w:t>أنماط التعلم / نوع الذكاء المستخدمة: ✓ لغوي     ✓ رياضي- منطقي     ✓ مكاني – بصري     ✓ حركي - جسدي     🖵 موسيقي - سمعي     ✓ إجتماعي     🖵 ذاتي - نفسي     🖵 طبيعي - بيولوجي</w:t>
+        <w:t>أنماط التعلم / نوع الذكاء المستخدمة: 🖵 لغوي     ✓ رياضي- منطقي     ✓ مكاني – بصري     ✓ حركي - جسدي     🖵 موسيقي - سمعي     🖵 إجتماعي     🖵 ذاتي - نفسي     🖵 طبيعي - بيولوجي</w:t>
       </w:r>
       <w:r>
         <w:rPr>
@@ -1193,7 +1165,7 @@
           <w:szCs w:val="26"/>
           <w:rtl w:val="1"/>
         </w:rPr>
-        <w:t xml:space="preserve">سرد قصة: </w:t>
+        <w:t xml:space="preserve">قصة رقعة الشطرنج: </w:t>
       </w:r>
       <w:r>
         <w:rPr>
@@ -1203,7 +1175,7 @@
           <w:szCs w:val="26"/>
           <w:rtl w:val="1"/>
         </w:rPr>
-        <w:t xml:space="preserve">يروي المعلم قصة مخترع الشطرنج الذي طلب من الملك مكافأة: حبّة قمح في المربع الأول، وحبّتين في الثاني، و4 في الثالث، وهكذا يتضاعف العدد في كل مربع.</w:t>
+        <w:t xml:space="preserve">حبّة قمح في المربع الأول، ثم يتضاعف العدد في كل مربع (1، 2، 4، 8…). يكمل التلاميذ جدول بطاقة التمهيد.</w:t>
       </w:r>
     </w:p>
     <w:p>
@@ -1234,38 +1206,7 @@
           <w:szCs w:val="26"/>
           <w:rtl w:val="1"/>
         </w:rPr>
-        <w:t xml:space="preserve">يعرض المعلم رقعة الشطرنج على اللوح التفاعلي ويسأل: كم حبّة في المربع الرابع؟ الخامس؟ (‪8 = 2×2×2‬ ، ‪16 = 2×2×2×2‬).</w:t>
-      </w:r>
-    </w:p>
-    <w:p>
-      <w:pPr>
-        <w:bidi w:val="1"/>
-        <w:spacing w:after="0" w:line="360" w:lineRule="auto"/>
-        <w:jc w:val="left"/>
-        <w:rPr>
-          <w:sz w:val="26"/>
-          <w:szCs w:val="26"/>
-        </w:rPr>
-      </w:pPr>
-      <w:r>
-        <w:rPr>
-          <w:b w:val="1"/>
-          <w:bCs w:val="1"/>
-          <w:sz w:val="26"/>
-          <w:szCs w:val="26"/>
-          <w:rtl w:val="1"/>
-        </w:rPr>
-        <w:t xml:space="preserve">ربط بالمكتسبات: </w:t>
-      </w:r>
-      <w:r>
-        <w:rPr>
-          <w:b w:val="0"/>
-          <w:bCs w:val="0"/>
-          <w:sz w:val="26"/>
-          <w:szCs w:val="26"/>
-          <w:rtl w:val="1"/>
-        </w:rPr>
-        <w:t xml:space="preserve">يذكّر بأن الضرب اختصار للجمع المتكرر (‪3+3+3+3 = 4×3‬)، ثم يطرح السؤال المحفّز: هل يوجد اختصار للضرب المتكرر؟ كيف نكتب عدد حبّات المربع 64 دون كتابة 63 عاملاً؟</w:t>
+        <w:t xml:space="preserve">الضرب اختصار للجمع المتكرر، فهل يوجد اختصار للضرب المتكرر؟</w:t>
       </w:r>
     </w:p>
     <w:p>
@@ -1396,7 +1337,7 @@
                 <w:highlight w:val="yellow"/>
                 <w:rtl w:val="1"/>
               </w:rPr>
-              <w:t xml:space="preserve">الوسائل: ورقة A4 لكل ثنائي – بطاقة استكشاف – لوح تفاعلي</w:t>
+              <w:t xml:space="preserve">الوسائل: ورقة A4 – بطاقة الاستكشاف</w:t>
             </w:r>
           </w:p>
         </w:tc>
@@ -1419,7 +1360,7 @@
                 <w:highlight w:val="yellow"/>
                 <w:rtl w:val="1"/>
               </w:rPr>
-              <w:t xml:space="preserve">الإستراتيجية: التعلّم بالاكتشاف (فكّر – زاوج – شارك)</w:t>
+              <w:t xml:space="preserve">الإستراتيجية: التعلّم بالاكتشاف (ثنائيات)</w:t>
             </w:r>
           </w:p>
         </w:tc>
@@ -1452,7 +1393,7 @@
                 <w:szCs w:val="28"/>
                 <w:rtl w:val="1"/>
               </w:rPr>
-              <w:t xml:space="preserve">سير النشاط (نشاط استكشافي: طيّ الورقة): </w:t>
+              <w:t xml:space="preserve">سير النشاط: </w:t>
             </w:r>
             <w:r>
               <w:rPr>
@@ -1463,7 +1404,7 @@
                 <w:szCs w:val="28"/>
                 <w:rtl w:val="1"/>
               </w:rPr>
-              <w:t xml:space="preserve">يوزّع المعلم على كل ثنائي ورقة A4 وبطاقة استكشاف فيها جدول (عدد الطيّات / عدد الطبقات / كتابة العدد على شكل جداء).</w:t>
+              <w:t xml:space="preserve">يطوي كل ثنائي ورقة نصفين عدّة مرات، ويعدّ الطبقات، ويملأ جدول بطاقة الاستكشاف.</w:t>
             </w:r>
           </w:p>
           <w:p>
@@ -1484,7 +1425,7 @@
                 <w:szCs w:val="28"/>
                 <w:rtl w:val="1"/>
               </w:rPr>
-              <w:t xml:space="preserve">فكّر – زاوج: </w:t>
+              <w:t xml:space="preserve">الملاحظة: </w:t>
             </w:r>
             <w:r>
               <w:rPr>
@@ -1495,7 +1436,7 @@
                 <w:szCs w:val="28"/>
                 <w:rtl w:val="1"/>
               </w:rPr>
-              <w:t xml:space="preserve">يطوي التلميذان الورقة نصفين ويعدّان الطبقات بعد كل طيّة (1، 2، 3، 4 طيّات) ويدوّنان النتائج: ‪2‬ ، ‪4 = 2×2‬ ، ‪8 = 2×2×2‬ ، ‪16 = 2×2×2×2‬.</w:t>
+              <w:t xml:space="preserve">العدد 2 يتكرّر، فيقدّم المعلم الترميز: ‪2×2×2×2 = 2⁴‬.</w:t>
             </w:r>
           </w:p>
           <w:p>
@@ -1516,7 +1457,7 @@
                 <w:szCs w:val="28"/>
                 <w:rtl w:val="1"/>
               </w:rPr>
-              <w:t xml:space="preserve">أسئلة موجّهة: </w:t>
+              <w:t xml:space="preserve">الخلاصة: </w:t>
             </w:r>
             <w:r>
               <w:rPr>
@@ -1527,7 +1468,7 @@
                 <w:szCs w:val="28"/>
                 <w:rtl w:val="1"/>
               </w:rPr>
-              <w:t xml:space="preserve">ماذا تلاحظون على العوامل؟ كم مرة تكرّر العدد 2؟ ما العلاقة بين عدد الطيّات وعدد العوامل؟ توقّعوا عدد الطبقات بعد 10 طيّات دون أن تطووا الورقة.</w:t>
+              <w:t xml:space="preserve">في ‪2⁴‬ الأساس 2 (العدد المكرَّر) والأس 4 (عدد مرات التكرار).</w:t>
             </w:r>
           </w:p>
           <w:p>
@@ -1548,7 +1489,7 @@
                 <w:szCs w:val="28"/>
                 <w:rtl w:val="1"/>
               </w:rPr>
-              <w:t xml:space="preserve">شارك: </w:t>
+              <w:t xml:space="preserve">انتبه: </w:t>
             </w:r>
             <w:r>
               <w:rPr>
@@ -1559,71 +1500,7 @@
                 <w:szCs w:val="28"/>
                 <w:rtl w:val="1"/>
               </w:rPr>
-              <w:t xml:space="preserve">تعرض الثنائيات اقتراحاتها لكتابة مختصرة، ثم يقدّم المعلم الترميز: ‪2×2×2×2 = 2⁴‬ وتُقرأ «2 أُس 4» أو «2 قوة 4».</w:t>
-            </w:r>
-          </w:p>
-          <w:p>
-            <w:pPr>
-              <w:bidi w:val="1"/>
-              <w:rPr>
-                <w:b w:val="0"/>
-                <w:sz w:val="28"/>
-                <w:szCs w:val="28"/>
-              </w:rPr>
-            </w:pPr>
-            <w:r>
-              <w:rPr>
-                <w:b w:val="1"/>
-                <w:bCs w:val="1"/>
-                <w:color w:val="0000ff"/>
-                <w:sz w:val="28"/>
-                <w:szCs w:val="28"/>
-                <w:rtl w:val="1"/>
-              </w:rPr>
-              <w:t xml:space="preserve">التفسير والاستنتاج: </w:t>
-            </w:r>
-            <w:r>
-              <w:rPr>
-                <w:b w:val="0"/>
-                <w:bCs w:val="0"/>
-                <w:color w:val="0000ff"/>
-                <w:sz w:val="28"/>
-                <w:szCs w:val="28"/>
-                <w:rtl w:val="1"/>
-              </w:rPr>
-              <w:t xml:space="preserve">يستنتج التلاميذ مع المعلم أن القوة ‪aⁿ‬ هي جداء n عاملاً كلٌّ منها يساوي a، حيث a هو الأساس (العدد المكرَّر) و n هو الأس (عدد مرات التكرار). حالات خاصة: ‪a²‬ مربّع العدد، ‪a³‬ مكعّبه، ‪a¹ = a‬.</w:t>
-            </w:r>
-          </w:p>
-          <w:p>
-            <w:pPr>
-              <w:bidi w:val="1"/>
-              <w:rPr>
-                <w:b w:val="0"/>
-                <w:sz w:val="28"/>
-                <w:szCs w:val="28"/>
-              </w:rPr>
-            </w:pPr>
-            <w:r>
-              <w:rPr>
-                <w:b w:val="1"/>
-                <w:bCs w:val="1"/>
-                <w:color w:val="0000ff"/>
-                <w:sz w:val="28"/>
-                <w:szCs w:val="28"/>
-                <w:rtl w:val="1"/>
-              </w:rPr>
-              <w:t xml:space="preserve">تصويب خطأ شائع: </w:t>
-            </w:r>
-            <w:r>
-              <w:rPr>
-                <w:b w:val="0"/>
-                <w:bCs w:val="0"/>
-                <w:color w:val="0000ff"/>
-                <w:sz w:val="28"/>
-                <w:szCs w:val="28"/>
-                <w:rtl w:val="1"/>
-              </w:rPr>
-              <w:t xml:space="preserve">يعرض المعلم الإجابة «‪2⁴ = 8‬» ويسأل: أين الخطأ؟ للتمييز بين ‪2⁴ = 2×2×2×2 = 16‬ و ‪2×4 = 8‬، ثم تُدوَّن الخلاصة في الدفاتر.</w:t>
+              <w:t xml:space="preserve">‪2⁴ = 16‬ وليس ‪2×4 = 8‬.</w:t>
             </w:r>
           </w:p>
         </w:tc>
@@ -1683,7 +1560,7 @@
                 <w:szCs w:val="28"/>
                 <w:rtl w:val="1"/>
               </w:rPr>
-              <w:t xml:space="preserve">بطاقة استكشاف بجدول نصف مُعبّأ، مع رسم توضيحي للطبقات.</w:t>
+              <w:t xml:space="preserve">جدول نصف مُعبّأ.</w:t>
             </w:r>
           </w:p>
           <w:p>
@@ -1716,40 +1593,7 @@
                 <w:szCs w:val="28"/>
                 <w:rtl w:val="1"/>
               </w:rPr>
-              <w:t xml:space="preserve">سؤال تحدٍّ: كم طبقة بعد 7 طيّات؟ وهل يمكن طيّ الورقة أكثر من 8 مرات؟ لماذا؟</w:t>
-            </w:r>
-          </w:p>
-          <w:p>
-            <w:pPr>
-              <w:bidi w:val="1"/>
-              <w:rPr>
-                <w:b w:val="1"/>
-                <w:color w:val="0000ff"/>
-                <w:sz w:val="28"/>
-                <w:szCs w:val="28"/>
-              </w:rPr>
-            </w:pPr>
-            <w:r>
-              <w:rPr>
-                <w:b w:val="1"/>
-                <w:bCs w:val="1"/>
-                <w:color w:val="0000ff"/>
-                <w:sz w:val="28"/>
-                <w:szCs w:val="28"/>
-                <w:rtl w:val="1"/>
-              </w:rPr>
-              <w:t xml:space="preserve">تشكيل الثنائيات: </w:t>
-            </w:r>
-            <w:r>
-              <w:rPr>
-                <w:b w:val="0"/>
-                <w:bCs w:val="0"/>
-                <w:color w:val="0000ff"/>
-                <w:sz w:val="28"/>
-                <w:szCs w:val="28"/>
-                <w:rtl w:val="1"/>
-              </w:rPr>
-              <w:t xml:space="preserve">غير متجانسة (متفوق + متعثر) ليقوم الأقوى بدور الشارح.</w:t>
+              <w:t xml:space="preserve">كم طبقة بعد 6 طيّات؟</w:t>
             </w:r>
           </w:p>
         </w:tc>
@@ -1885,7 +1729,7 @@
                 <w:highlight w:val="yellow"/>
                 <w:rtl w:val="1"/>
               </w:rPr>
-              <w:t xml:space="preserve">الوسائل: بطاقات عمل متدرّجة بثلاثة ألوان – لوح تفاعلي</w:t>
+              <w:t xml:space="preserve">الوسائل: ثلاث بطاقات ملوّنة</w:t>
             </w:r>
           </w:p>
         </w:tc>
@@ -1908,7 +1752,7 @@
                 <w:highlight w:val="yellow"/>
                 <w:rtl w:val="1"/>
               </w:rPr>
-              <w:t xml:space="preserve">الإستراتيجية: التعليم المتمايز (بطاقات متدرّجة)</w:t>
+              <w:t xml:space="preserve">الإستراتيجية: التعليم المتمايز</w:t>
             </w:r>
           </w:p>
         </w:tc>
@@ -1952,7 +1796,7 @@
                 <w:szCs w:val="28"/>
                 <w:rtl w:val="1"/>
               </w:rPr>
-              <w:t xml:space="preserve">يوزّع المعلم التلاميذ وفق ملاحظاته في النشاط الاستكشافي على ثلاث فئات، ويأخذ كل تلميذ بطاقة بلون مستواه، مع إمكانية الانتقال إلى البطاقة الأعلى عند إنهاء بطاقته:</w:t>
+              <w:t xml:space="preserve">يأخذ كل تلميذ بطاقة حسب مستواه:</w:t>
             </w:r>
           </w:p>
           <w:p>
@@ -1973,7 +1817,7 @@
                 <w:szCs w:val="28"/>
                 <w:rtl w:val="1"/>
               </w:rPr>
-              <w:t xml:space="preserve">البطاقة الخضراء (مستوى الدعم): </w:t>
+              <w:t xml:space="preserve">الخضراء (دعم): </w:t>
             </w:r>
             <w:r>
               <w:rPr>
@@ -1984,7 +1828,7 @@
                 <w:szCs w:val="28"/>
                 <w:rtl w:val="1"/>
               </w:rPr>
-              <w:t xml:space="preserve">1) اكتب على شكل قوة: ‪3×3×3×3‬ ، ‪7×7‬ ، ‪10×10×10‬.  2) أكمل: في ‪5³‬ الأساس … والأس … والجداء … .  3) احسب: ‪2³‬ ، ‪4²‬.</w:t>
+              <w:t xml:space="preserve">كتابة جداء على شكل قوة، وتحديد الأساس والأس.</w:t>
             </w:r>
           </w:p>
           <w:p>
@@ -2005,7 +1849,7 @@
                 <w:szCs w:val="28"/>
                 <w:rtl w:val="1"/>
               </w:rPr>
-              <w:t xml:space="preserve">البطاقة الصفراء (المستوى الأساسي): </w:t>
+              <w:t xml:space="preserve">الصفراء (أساسي): </w:t>
             </w:r>
             <w:r>
               <w:rPr>
@@ -2016,7 +1860,7 @@
                 <w:szCs w:val="28"/>
                 <w:rtl w:val="1"/>
               </w:rPr>
-              <w:t xml:space="preserve">1) احسب: ‪3⁴‬ ، ‪10⁵‬ ، ‪1⁹‬ ، ‪0⁶‬.  2) ضع = أو ≠ مع التعليل: ‪2³ … 2×3‬ ، ‪3² … 9‬.  3) اكتب 32 و 81 على شكل قوة.</w:t>
+              <w:t xml:space="preserve">حساب قيم قوى، والتمييز بين ‪2³‬ و ‪2×3‬.</w:t>
             </w:r>
           </w:p>
           <w:p>
@@ -2037,7 +1881,7 @@
                 <w:szCs w:val="28"/>
                 <w:rtl w:val="1"/>
               </w:rPr>
-              <w:t xml:space="preserve">البطاقة الحمراء (مستوى الإثراء): </w:t>
+              <w:t xml:space="preserve">الحمراء (إثراء): </w:t>
             </w:r>
             <w:r>
               <w:rPr>
@@ -2048,7 +1892,7 @@
                 <w:szCs w:val="28"/>
                 <w:rtl w:val="1"/>
               </w:rPr>
-              <w:t xml:space="preserve">1) خلية بكتيريا تنقسم إلى خليتين كل ساعة. كم خلية بعد 6 ساعات؟ اكتب الجواب على شكل قوة ثم احسبه.  2) اكتب 64 على شكل قوة بثلاث طرق مختلفة.  3) قارن دون آلة حاسبة: ‪2⁵‬ و ‪5²‬.</w:t>
+              <w:t xml:space="preserve">مسألة حياتية، وكتابة 64 على شكل قوة.</w:t>
             </w:r>
           </w:p>
           <w:p>
@@ -2062,25 +1906,12 @@
             </w:pPr>
             <w:r>
               <w:rPr>
-                <w:b w:val="1"/>
-                <w:bCs w:val="1"/>
                 <w:color w:val="0000ff"/>
                 <w:sz w:val="28"/>
                 <w:szCs w:val="28"/>
                 <w:rtl w:val="1"/>
               </w:rPr>
-              <w:t xml:space="preserve">المتابعة والتغذية الراجعة: </w:t>
-            </w:r>
-            <w:r>
-              <w:rPr>
-                <w:b w:val="0"/>
-                <w:bCs w:val="0"/>
-                <w:color w:val="0000ff"/>
-                <w:sz w:val="28"/>
-                <w:szCs w:val="28"/>
-                <w:rtl w:val="1"/>
-              </w:rPr>
-              <w:t xml:space="preserve">يتجوّل المعلم بين الفئات؛ يقدّم دعماً مباشراً للفئة الخضراء ويطرح أسئلة تفكير على الفئة الحمراء، ثم تُعرض نماذج من الحلول على اللوح التفاعلي مع تغذية راجعة تصحيحية وتعزيزية.</w:t>
+              <w:t xml:space="preserve">يتابع المعلم الفئات ويصحّح نماذج من الحلول على اللوح.</w:t>
             </w:r>
           </w:p>
         </w:tc>
@@ -2123,24 +1954,12 @@
             <w:r>
               <w:rPr>
                 <w:b w:val="1"/>
-                <w:bCs w:val="1"/>
                 <w:color w:val="0000ff"/>
                 <w:sz w:val="28"/>
                 <w:szCs w:val="28"/>
                 <w:rtl w:val="1"/>
               </w:rPr>
-              <w:t xml:space="preserve">الخضراء: </w:t>
-            </w:r>
-            <w:r>
-              <w:rPr>
-                <w:b w:val="0"/>
-                <w:bCs w:val="0"/>
-                <w:color w:val="0000ff"/>
-                <w:sz w:val="28"/>
-                <w:szCs w:val="28"/>
-                <w:rtl w:val="1"/>
-              </w:rPr>
-              <w:t xml:space="preserve">مثال محلول في رأس البطاقة، والأساس والأس بلونين مختلفين.</w:t>
+              <w:t xml:space="preserve">من ينهي بطاقته ينتقل إلى البطاقة التالية.</w:t>
             </w:r>
           </w:p>
           <w:p>
@@ -2156,123 +1975,12 @@
             <w:r>
               <w:rPr>
                 <w:b w:val="1"/>
-                <w:bCs w:val="1"/>
                 <w:color w:val="0000ff"/>
                 <w:sz w:val="28"/>
                 <w:szCs w:val="28"/>
                 <w:rtl w:val="1"/>
               </w:rPr>
-              <w:t xml:space="preserve">الصفراء: </w:t>
-            </w:r>
-            <w:r>
-              <w:rPr>
-                <w:b w:val="0"/>
-                <w:bCs w:val="0"/>
-                <w:color w:val="0000ff"/>
-                <w:sz w:val="28"/>
-                <w:szCs w:val="28"/>
-                <w:rtl w:val="1"/>
-              </w:rPr>
-              <w:t xml:space="preserve">الآلة الحاسبة للتحقق فقط بعد الحل.</w:t>
-            </w:r>
-          </w:p>
-          <w:p>
-            <w:pPr>
-              <w:bidi w:val="1"/>
-              <w:rPr>
-                <w:b w:val="1"/>
-                <w:color w:val="0000ff"/>
-                <w:sz w:val="28"/>
-                <w:szCs w:val="28"/>
-              </w:rPr>
-            </w:pPr>
-            <w:r>
-              <w:rPr>
-                <w:b w:val="1"/>
-                <w:bCs w:val="1"/>
-                <w:color w:val="0000ff"/>
-                <w:sz w:val="28"/>
-                <w:szCs w:val="28"/>
-                <w:rtl w:val="1"/>
-              </w:rPr>
-              <w:t xml:space="preserve">الحمراء: </w:t>
-            </w:r>
-            <w:r>
-              <w:rPr>
-                <w:b w:val="0"/>
-                <w:bCs w:val="0"/>
-                <w:color w:val="0000ff"/>
-                <w:sz w:val="28"/>
-                <w:szCs w:val="28"/>
-                <w:rtl w:val="1"/>
-              </w:rPr>
-              <w:t xml:space="preserve">مسائل حياتية مفتوحة تنمّي مهارات التفكير العليا.</w:t>
-            </w:r>
-          </w:p>
-          <w:p>
-            <w:pPr>
-              <w:bidi w:val="1"/>
-              <w:rPr>
-                <w:b w:val="1"/>
-                <w:color w:val="0000ff"/>
-                <w:sz w:val="28"/>
-                <w:szCs w:val="28"/>
-              </w:rPr>
-            </w:pPr>
-            <w:r>
-              <w:rPr>
-                <w:b w:val="1"/>
-                <w:bCs w:val="1"/>
-                <w:color w:val="0000ff"/>
-                <w:sz w:val="28"/>
-                <w:szCs w:val="28"/>
-                <w:rtl w:val="1"/>
-              </w:rPr>
-              <w:t xml:space="preserve">مبدأ «أنهيتَ؟ انتقل للبطاقة التالية» </w:t>
-            </w:r>
-            <w:r>
-              <w:rPr>
-                <w:b w:val="0"/>
-                <w:bCs w:val="0"/>
-                <w:color w:val="0000ff"/>
-                <w:sz w:val="28"/>
-                <w:szCs w:val="28"/>
-                <w:rtl w:val="1"/>
-              </w:rPr>
-              <w:t xml:space="preserve">لتجنّب وقت الفراغ.</w:t>
-            </w:r>
-          </w:p>
-          <w:p>
-            <w:pPr>
-              <w:bidi w:val="1"/>
-              <w:rPr>
-                <w:b w:val="1"/>
-                <w:color w:val="0000ff"/>
-                <w:sz w:val="28"/>
-                <w:szCs w:val="28"/>
-              </w:rPr>
-            </w:pPr>
-            <w:r>
-              <w:rPr>
-                <w:b w:val="1"/>
-                <w:bCs w:val="1"/>
-                <w:color w:val="0000ff"/>
-                <w:sz w:val="28"/>
-                <w:szCs w:val="28"/>
-                <w:rtl w:val="1"/>
-              </w:rPr>
-              <w:t xml:space="preserve">التلميذ الخبير: </w:t>
-            </w:r>
-            <w:r>
-              <w:rPr>
-                <w:b w:val="0"/>
-                <w:bCs w:val="0"/>
-                <w:color w:val="0000ff"/>
-                <w:sz w:val="28"/>
-                <w:szCs w:val="28"/>
-                <w:rtl w:val="1"/>
-              </w:rPr>
-              <w:t xml:space="preserve">تلميذ من الفئة الحمراء يساعد زملاءه بعد إنهاء بطاقته.</w:t>
+              <w:t xml:space="preserve">تلميذ متفوّق يساعد زملاءه.</w:t>
             </w:r>
           </w:p>
         </w:tc>
@@ -2319,30 +2027,7 @@
           <w:highlight w:val="white"/>
           <w:rtl w:val="1"/>
         </w:rPr>
-        <w:t xml:space="preserve">النشاط التقييمي: ✓أسئلة شفهية    ✓بطاقة تقييم    🖵عمل مجموعات    🖵مناقشة و حوار      المدة : 10 د.</w:t>
-      </w:r>
-    </w:p>
-    <w:p>
-      <w:pPr>
-        <w:tabs>
-          <w:tab w:val="left" w:pos="9885"/>
-        </w:tabs>
-        <w:bidi w:val="1"/>
-        <w:spacing w:after="0" w:lineRule="auto"/>
-        <w:rPr>
-          <w:sz w:val="28"/>
-          <w:szCs w:val="28"/>
-        </w:rPr>
-      </w:pPr>
-      <w:r>
-        <w:rPr>
-          <w:b w:val="1"/>
-          <w:bCs w:val="1"/>
-          <w:sz w:val="28"/>
-          <w:szCs w:val="28"/>
-          <w:rtl w:val="1"/>
-        </w:rPr>
-        <w:t xml:space="preserve">بطاقة تقييم فردية (بطاقة خروج):</w:t>
+        <w:t xml:space="preserve">النشاط التقييمي: 🖵أسئلة شفهية    ✓بطاقة تقييم    🖵عمل مجموعات    🖵مناقشة و حوار      المدة : 10 د.</w:t>
       </w:r>
     </w:p>
     <w:p>
@@ -2363,103 +2048,7 @@
           <w:szCs w:val="28"/>
           <w:rtl w:val="1"/>
         </w:rPr>
-        <w:t xml:space="preserve">1) اكتب على شكل قوة: ‪6×6×6×6×6 = ……‬</w:t>
-      </w:r>
-    </w:p>
-    <w:p>
-      <w:pPr>
-        <w:tabs>
-          <w:tab w:val="left" w:pos="9885"/>
-        </w:tabs>
-        <w:bidi w:val="1"/>
-        <w:spacing w:after="0" w:lineRule="auto"/>
-        <w:rPr>
-          <w:sz w:val="28"/>
-          <w:szCs w:val="28"/>
-        </w:rPr>
-      </w:pPr>
-      <w:r>
-        <w:rPr>
-          <w:sz w:val="28"/>
-          <w:szCs w:val="28"/>
-          <w:rtl w:val="1"/>
-        </w:rPr>
-        <w:t xml:space="preserve">2) في القوة ‪7⁴‬ : الأساس = …… ، الأس = ……</w:t>
-      </w:r>
-    </w:p>
-    <w:p>
-      <w:pPr>
-        <w:tabs>
-          <w:tab w:val="left" w:pos="9885"/>
-        </w:tabs>
-        <w:bidi w:val="1"/>
-        <w:spacing w:after="0" w:lineRule="auto"/>
-        <w:rPr>
-          <w:sz w:val="28"/>
-          <w:szCs w:val="28"/>
-        </w:rPr>
-      </w:pPr>
-      <w:r>
-        <w:rPr>
-          <w:sz w:val="28"/>
-          <w:szCs w:val="28"/>
-          <w:rtl w:val="1"/>
-        </w:rPr>
-        <w:t xml:space="preserve">3) احسب: ‪5² = ……‬ ، ‪2⁵ = ……‬</w:t>
-      </w:r>
-    </w:p>
-    <w:p>
-      <w:pPr>
-        <w:tabs>
-          <w:tab w:val="left" w:pos="9885"/>
-        </w:tabs>
-        <w:bidi w:val="1"/>
-        <w:spacing w:after="0" w:lineRule="auto"/>
-        <w:rPr>
-          <w:sz w:val="28"/>
-          <w:szCs w:val="28"/>
-        </w:rPr>
-      </w:pPr>
-      <w:r>
-        <w:rPr>
-          <w:sz w:val="28"/>
-          <w:szCs w:val="28"/>
-          <w:rtl w:val="1"/>
-        </w:rPr>
-        <w:t xml:space="preserve">4) صح أم خطأ؟ صحّح الخطأ: ‪4³ = 12‬</w:t>
-      </w:r>
-    </w:p>
-    <w:p>
-      <w:pPr>
-        <w:tabs>
-          <w:tab w:val="left" w:pos="9885"/>
-        </w:tabs>
-        <w:bidi w:val="1"/>
-        <w:spacing w:after="0" w:lineRule="auto"/>
-        <w:rPr>
-          <w:sz w:val="28"/>
-          <w:szCs w:val="28"/>
-        </w:rPr>
-      </w:pPr>
-      <w:r>
-        <w:rPr>
-          <w:b w:val="1"/>
-          <w:bCs w:val="1"/>
-          <w:sz w:val="28"/>
-          <w:szCs w:val="28"/>
-          <w:rtl w:val="1"/>
-        </w:rPr>
-        <w:t xml:space="preserve">أسئلة شفهية سريعة: </w:t>
-      </w:r>
-      <w:r>
-        <w:rPr>
-          <w:b w:val="0"/>
-          <w:bCs w:val="0"/>
-          <w:sz w:val="28"/>
-          <w:szCs w:val="28"/>
-          <w:rtl w:val="1"/>
-        </w:rPr>
-        <w:t xml:space="preserve">ما الفرق بين ‪3²‬ و ‪3×2‬؟ ماذا يمثّل الأس؟ – تُصنَّف نتائج البطاقة لتوجيه الحصة التالية.</w:t>
+        <w:t xml:space="preserve">بطاقة تقييم فردية من 4 أسئلة: كتابة قوة، تحديد الأساس والأس، حساب قيمة، تصحيح خطأ.</w:t>
       </w:r>
     </w:p>
     <w:p>
@@ -2509,7 +2098,7 @@
           <w:highlight w:val="white"/>
           <w:rtl w:val="1"/>
         </w:rPr>
-        <w:t xml:space="preserve">تمرين مشترك: تمرين 1 و2 من بطاقة القوى (كتابة جداءات على شكل قوة وحساب قيمها).</w:t>
+        <w:t xml:space="preserve">تمرين 1 و2 من بطاقة القوى.</w:t>
       </w:r>
     </w:p>
     <w:p>
@@ -2533,31 +2122,7 @@
           <w:highlight w:val="white"/>
           <w:rtl w:val="1"/>
         </w:rPr>
-        <w:t xml:space="preserve">بطاقة دعم (للمتعثرين): 5 تمارين موجّهة مع مثال محلول عبر منصة التلميذ.</w:t>
-      </w:r>
-    </w:p>
-    <w:p>
-      <w:pPr>
-        <w:shd w:fill="ffffff" w:val="clear"/>
-        <w:bidi w:val="1"/>
-        <w:spacing w:after="0" w:lineRule="auto"/>
-        <w:jc w:val="left"/>
-        <w:rPr>
-          <w:b w:val="1"/>
-          <w:sz w:val="28"/>
-          <w:szCs w:val="28"/>
-          <w:highlight w:val="white"/>
-        </w:rPr>
-      </w:pPr>
-      <w:r>
-        <w:rPr>
-          <w:b w:val="1"/>
-          <w:sz w:val="28"/>
-          <w:szCs w:val="28"/>
-          <w:highlight w:val="white"/>
-          <w:rtl w:val="1"/>
-        </w:rPr>
-        <w:t xml:space="preserve">بطاقة إثراء (للمتفوقين): احسب عدد حبّات القمح في المربع العاشر من رقعة الشطرنج واكتبه على شكل قوة.</w:t>
+        <w:t xml:space="preserve">للمتفوقين: اكتب عدد حبّات القمح في المربع العاشر على شكل قوة.</w:t>
       </w:r>
     </w:p>
     <w:p>

</xml_diff>